<commit_message>
update: 2026/09/24 夜間 新聞站更新
</commit_message>
<xml_diff>
--- a/日報/260924_報告總覽_夜間.docx
+++ b/日報/260924_報告總覽_夜間.docx
@@ -35,17 +35,12 @@
     </w:p>
     <w:p>
       <w:r>
-        <w:t>• 強茂（2481）：野村證券指 AI 資料中心功率分離元件取得更多訂單並漲價，估第 3、4 季營收季增 10%、5%，建議「買進」、目標價升至 214 元（經濟日報 09/24 17:45 外資升價股整理稿引述；★報告日期與前值未載）。</w:t>
-      </w:r>
-    </w:p>
-    <w:p>
-      <w:r>
         <w:t>• 光通訊產業：摩根士丹利解讀 ECOC 大會，業界共識轉為「NPO 2028 年落地首批產品」，光通訊供應鏈產能 12～18 個月幾近售罄，磷化銦（InP）基板最緊俏。★大摩未對個股給評等或目標價（經濟日報 09/24 15:24）。</w:t>
       </w:r>
     </w:p>
     <w:p>
       <w:r>
-        <w:t>• 同稿整理之創意（瑞銀 8,660 元）、健策（大和 9,420 元）、奇鋐（麥格理 4,600 元）、信驊（大和 26,660 元）等外資升價股，本站先前場次均已收錄，本場次不重複列入。</w:t>
+        <w:t>• 同稿整理之創意（瑞銀 8,660 元）、健策（大和 9,420 元）、奇鋐（麥格理 4,600 元）、信驊（大和 26,660 元）、強茂（野村 214 元，09/20 已收錄）等外資升價股，本站先前場次均已收錄，本場次不重複列入。</w:t>
       </w:r>
     </w:p>
     <w:p>
@@ -195,68 +190,6 @@
           <w:p>
             <w:r>
               <w:t>TPU v8t 周期延長、v9 2029 年強勁成長；2028/2029 TPU 銷售估 435/525 億美元</w:t>
-            </w:r>
-          </w:p>
-        </w:tc>
-      </w:tr>
-      <w:tr>
-        <w:tc>
-          <w:tcPr>
-            <w:tcW w:type="dxa" w:w="1440"/>
-          </w:tcPr>
-          <w:p>
-            <w:r>
-              <w:t>半導體－功率分離元件</w:t>
-            </w:r>
-          </w:p>
-        </w:tc>
-        <w:tc>
-          <w:tcPr>
-            <w:tcW w:type="dxa" w:w="1440"/>
-          </w:tcPr>
-          <w:p>
-            <w:r>
-              <w:t>強茂(2481)</w:t>
-            </w:r>
-          </w:p>
-        </w:tc>
-        <w:tc>
-          <w:tcPr>
-            <w:tcW w:type="dxa" w:w="1440"/>
-          </w:tcPr>
-          <w:p>
-            <w:r>
-              <w:t>野村證券 Nomura</w:t>
-            </w:r>
-          </w:p>
-        </w:tc>
-        <w:tc>
-          <w:tcPr>
-            <w:tcW w:type="dxa" w:w="1440"/>
-          </w:tcPr>
-          <w:p>
-            <w:r>
-              <w:t>買進</w:t>
-            </w:r>
-          </w:p>
-        </w:tc>
-        <w:tc>
-          <w:tcPr>
-            <w:tcW w:type="dxa" w:w="1440"/>
-          </w:tcPr>
-          <w:p>
-            <w:r>
-              <w:t>214 元（前值 ★未載）</w:t>
-            </w:r>
-          </w:p>
-        </w:tc>
-        <w:tc>
-          <w:tcPr>
-            <w:tcW w:type="dxa" w:w="1440"/>
-          </w:tcPr>
-          <w:p>
-            <w:r>
-              <w:t>AI 資料中心功率元件訂單增加並漲價；Q3/Q4 營收估季增 10%/5%</w:t>
             </w:r>
           </w:p>
         </w:tc>

</xml_diff>